<commit_message>
docs: update final handover report
</commit_message>
<xml_diff>
--- a/dokumentation/abschlussdokumentation.docx
+++ b/dokumentation/abschlussdokumentation.docx
@@ -2239,7 +2239,7 @@
               <w:rPr>
                 <w:sz w:val="14"/>
               </w:rPr>
-              <w:t>Backup belegt; Restore mit Checksumme und Datenvergleich noch eindeutig nachweisen.</w:t>
+              <w:t>Fuer pacman-dev vollstaendig belegt: SHA-256-Pruefung, Datenvergleich und UI-Nachweis. Kein Restore in Prod.</w:t>
             </w:r>
           </w:p>
         </w:tc>
@@ -2267,7 +2267,7 @@
               <w:rPr>
                 <w:sz w:val="14"/>
               </w:rPr>
-              <w:t>Unmittelbar vor Abgabe neu erfassen.</w:t>
+              <w:t>Stand 29.09.2026: App 608d061 und GitOps fa4ec17 sauber auf origin/main. Hauptrepo 6412c4e; Arbeitsbaum mit 2 geloeschten und 2 unversionierten Skripten. Finalen Abgabe-HEAD nach Klaerung neu erfassen.</w:t>
             </w:r>
           </w:p>
         </w:tc>
@@ -2295,7 +2295,7 @@
               <w:rPr>
                 <w:sz w:val="14"/>
               </w:rPr>
-              <w:t>Aktuelle Dev-/Prod-Digests vor Übergabe separat erfassen.</w:t>
+              <w:t>Am 29.09.2026 live verifiziert; laufende Pods stimmen ueberein. Dev sha256:f3da04a53e86376e0adb533c9e6d523b34c958ae23fd423da570e8b32da36b38; Prod sha256:8a30554bf682a9a326f1227ec0e3978eab03b982bbe41e0d13ab1aad21d379f6.</w:t>
             </w:r>
           </w:p>
         </w:tc>
@@ -2323,7 +2323,7 @@
               <w:rPr>
                 <w:sz w:val="14"/>
               </w:rPr>
-              <w:t>T30 bestanden dokumentiert; eigener Abschlussnachweis vorhanden: screenshots/21_tests/T30_prod_abnahme_e2e_http200.png.</w:t>
+              <w:t>Bestanden (26.08.2026), im Testprotokoll dokumentiert. Screenshot vorhanden: screenshots/21_tests/T30_prod_abnahme_e2e_http200.png.</w:t>
             </w:r>
           </w:p>
         </w:tc>

</xml_diff>